<commit_message>
Working through reviewer comments and cleanining up code base for pub
</commit_message>
<xml_diff>
--- a/Docs/00_CanJFS/R1_18062026/CommentsFromReviewersOriginal_18062026.docx
+++ b/Docs/00_CanJFS/R1_18062026/CommentsFromReviewersOriginal_18062026.docx
@@ -927,98 +927,185 @@
     </w:p>
     <w:p>
       <w:r>
+        <w:rPr>
+          <w:highlight w:val="yellow"/>
+        </w:rPr>
         <w:t>Line 129. Is that histogram shown somewhere?</w:t>
       </w:r>
       <w:r>
         <w:br/>
+      </w:r>
+      <w:r>
+        <w:rPr>
+          <w:highlight w:val="yellow"/>
+        </w:rPr>
         <w:t>Line 142-163 Really cool approach! We should all be doing that!</w:t>
       </w:r>
       <w:r>
         <w:br/>
+      </w:r>
+      <w:r>
+        <w:rPr>
+          <w:highlight w:val="yellow"/>
+        </w:rPr>
         <w:t xml:space="preserve">Line 163-169. </w:t>
       </w:r>
       <w:proofErr w:type="gramStart"/>
       <w:r>
+        <w:rPr>
+          <w:highlight w:val="yellow"/>
+        </w:rPr>
         <w:t>So</w:t>
       </w:r>
       <w:proofErr w:type="gramEnd"/>
       <w:r>
+        <w:rPr>
+          <w:highlight w:val="yellow"/>
+        </w:rPr>
         <w:t xml:space="preserve"> </w:t>
       </w:r>
       <w:proofErr w:type="gramStart"/>
       <w:r>
+        <w:rPr>
+          <w:highlight w:val="yellow"/>
+        </w:rPr>
         <w:t>is</w:t>
       </w:r>
       <w:proofErr w:type="gramEnd"/>
       <w:r>
+        <w:rPr>
+          <w:highlight w:val="yellow"/>
+        </w:rPr>
         <w:t xml:space="preserve"> </w:t>
       </w:r>
       <w:proofErr w:type="gramStart"/>
       <w:r>
+        <w:rPr>
+          <w:highlight w:val="yellow"/>
+        </w:rPr>
         <w:t>it</w:t>
       </w:r>
       <w:proofErr w:type="gramEnd"/>
       <w:r>
+        <w:rPr>
+          <w:highlight w:val="yellow"/>
+        </w:rPr>
         <w:t xml:space="preserve"> quartiles or </w:t>
       </w:r>
       <w:proofErr w:type="gramStart"/>
       <w:r>
+        <w:rPr>
+          <w:highlight w:val="yellow"/>
+        </w:rPr>
         <w:t>is</w:t>
       </w:r>
       <w:proofErr w:type="gramEnd"/>
       <w:r>
+        <w:rPr>
+          <w:highlight w:val="yellow"/>
+        </w:rPr>
         <w:t xml:space="preserve"> </w:t>
       </w:r>
       <w:proofErr w:type="gramStart"/>
       <w:r>
+        <w:rPr>
+          <w:highlight w:val="yellow"/>
+        </w:rPr>
         <w:t>it</w:t>
       </w:r>
       <w:proofErr w:type="gramEnd"/>
       <w:r>
+        <w:rPr>
+          <w:highlight w:val="yellow"/>
+        </w:rPr>
         <w:t xml:space="preserve"> predefined ranges? I assume start and end of run vary among years?</w:t>
       </w:r>
       <w:r>
         <w:br/>
+      </w:r>
+      <w:r>
+        <w:rPr>
+          <w:highlight w:val="yellow"/>
+        </w:rPr>
         <w:t>Line 170. What do you mean by “identified”?</w:t>
       </w:r>
       <w:r>
         <w:br/>
+      </w:r>
+    </w:p>
+    <w:p>
+      <w:r>
+        <w:rPr>
+          <w:highlight w:val="yellow"/>
+        </w:rPr>
         <w:t xml:space="preserve">Line 178. </w:t>
       </w:r>
       <w:proofErr w:type="gramStart"/>
       <w:r>
+        <w:rPr>
+          <w:highlight w:val="yellow"/>
+        </w:rPr>
         <w:t>So</w:t>
       </w:r>
       <w:proofErr w:type="gramEnd"/>
       <w:r>
+        <w:rPr>
+          <w:highlight w:val="yellow"/>
+        </w:rPr>
         <w:t xml:space="preserve"> you tested 2-6 and then chose 6. Did you check if higher numbers of k would have produced better silhouette results? The clustering approach seems a bit at odds with the Bayesian assignment carried out before (and a bit awkward since you then </w:t>
       </w:r>
       <w:proofErr w:type="gramStart"/>
       <w:r>
+        <w:rPr>
+          <w:highlight w:val="yellow"/>
+        </w:rPr>
         <w:t>have to</w:t>
       </w:r>
       <w:proofErr w:type="gramEnd"/>
       <w:r>
+        <w:rPr>
+          <w:highlight w:val="yellow"/>
+        </w:rPr>
         <w:t xml:space="preserve"> manually move one of the tributaries at which </w:t>
       </w:r>
       <w:proofErr w:type="gramStart"/>
       <w:r>
+        <w:rPr>
+          <w:highlight w:val="yellow"/>
+        </w:rPr>
         <w:t>point</w:t>
       </w:r>
       <w:proofErr w:type="gramEnd"/>
       <w:r>
+        <w:rPr>
+          <w:highlight w:val="yellow"/>
+        </w:rPr>
         <w:t xml:space="preserve"> why not just make groups based on your expert knowledge). How closely do these clusters align with management units or other groupings people commonly </w:t>
       </w:r>
       <w:proofErr w:type="spellStart"/>
       <w:r>
+        <w:rPr>
+          <w:highlight w:val="yellow"/>
+        </w:rPr>
         <w:t>use</w:t>
       </w:r>
       <w:proofErr w:type="spellEnd"/>
       <w:r>
+        <w:rPr>
+          <w:highlight w:val="yellow"/>
+        </w:rPr>
         <w:t xml:space="preserve"> for this watershed? If k means clustering is really the best approach explain that a bit more here in the methods (why not just use the tributary level for your analysis or if grouping is needed maybe tree-based approaches can separate out groups more consistently).</w:t>
       </w:r>
       <w:r>
         <w:br/>
+      </w:r>
+    </w:p>
+    <w:p/>
+    <w:p>
+      <w:r>
+        <w:rPr>
+          <w:highlight w:val="yellow"/>
+        </w:rPr>
         <w:t>Line 206-209. Why are the simulated time frames constrained to a shift of only a few days.</w:t>
       </w:r>
       <w:r>
@@ -1026,107 +1113,213 @@
       </w:r>
       <w:r>
         <w:br/>
+      </w:r>
+    </w:p>
+    <w:p/>
+    <w:p>
+      <w:r>
+        <w:rPr>
+          <w:highlight w:val="yellow"/>
+        </w:rPr>
         <w:t>Results</w:t>
       </w:r>
       <w:r>
-        <w:br/>
-        <w:t>Line 216-218. This shift in seasonal contribution from upstream to downstream is very hard to see given how Fig. 3 is organized. Have you tried what this looks like when facetted by group and with Quantile as x axis and % contribution as y?</w:t>
-      </w:r>
-      <w:r>
-        <w:br/>
-      </w:r>
-      <w:r>
-        <w:br/>
-      </w:r>
-      <w:r>
+        <w:rPr>
+          <w:highlight w:val="yellow"/>
+        </w:rPr>
+        <w:br/>
+        <w:t xml:space="preserve">Line 216-218. This shift in seasonal contribution from upstream to downstream is very hard to see given how Fig. 3 is organized. Have you tried what this looks like when </w:t>
+      </w:r>
+      <w:proofErr w:type="gramStart"/>
+      <w:r>
+        <w:rPr>
+          <w:highlight w:val="yellow"/>
+        </w:rPr>
+        <w:t>facetted</w:t>
+      </w:r>
+      <w:proofErr w:type="gramEnd"/>
+      <w:r>
+        <w:rPr>
+          <w:highlight w:val="yellow"/>
+        </w:rPr>
+        <w:t xml:space="preserve"> by group and with Quantile as x axis and % contribution as y?</w:t>
+      </w:r>
+      <w:r>
+        <w:br/>
+      </w:r>
+    </w:p>
+    <w:p>
+      <w:r>
+        <w:rPr>
+          <w:highlight w:val="yellow"/>
+        </w:rPr>
+        <w:t>Discussion</w:t>
+      </w:r>
+      <w:r>
+        <w:rPr>
+          <w:highlight w:val="yellow"/>
+        </w:rPr>
+        <w:br/>
+        <w:t>The discussion does a very good job of summarizing the results and explaining the potential implications for management. Since this is a study about return timing and spatial patterns within a large watershed the discussion could have been broader and incorporated findings from other Chinook salmon watersheds (e.g. Central Valley where lots of otolith work about tributary specific use of runs has been carried out).</w:t>
+      </w:r>
+    </w:p>
+    <w:p>
+      <w:r>
+        <w:br/>
+      </w:r>
+      <w:r>
+        <w:rPr>
+          <w:highlight w:val="yellow"/>
+        </w:rPr>
+        <w:t xml:space="preserve">The tradeoff between protection and harvest is well illustrated but could be expanded further by exploring the effects of protecting species across multiple years. </w:t>
+      </w:r>
+      <w:proofErr w:type="gramStart"/>
+      <w:r>
+        <w:rPr>
+          <w:highlight w:val="yellow"/>
+        </w:rPr>
+        <w:t>So</w:t>
+      </w:r>
+      <w:proofErr w:type="gramEnd"/>
+      <w:r>
+        <w:rPr>
+          <w:highlight w:val="yellow"/>
+        </w:rPr>
+        <w:t xml:space="preserve"> by increasing protection in yr1 how much more harvest could be expected in the next return year (3 years later?). Over what time frame do </w:t>
+      </w:r>
+      <w:proofErr w:type="gramStart"/>
+      <w:r>
+        <w:rPr>
+          <w:highlight w:val="yellow"/>
+        </w:rPr>
+        <w:t>these local harvest</w:t>
+      </w:r>
+      <w:proofErr w:type="gramEnd"/>
+      <w:r>
+        <w:rPr>
+          <w:highlight w:val="yellow"/>
+        </w:rPr>
+        <w:t xml:space="preserve"> fisheries operate (could they </w:t>
+      </w:r>
+      <w:proofErr w:type="gramStart"/>
+      <w:r>
+        <w:rPr>
+          <w:highlight w:val="yellow"/>
+        </w:rPr>
+        <w:t>compensate</w:t>
+      </w:r>
+      <w:proofErr w:type="gramEnd"/>
+      <w:r>
+        <w:rPr>
+          <w:highlight w:val="yellow"/>
+        </w:rPr>
+        <w:t xml:space="preserve"> reduced harvest in a year with potentially higher harvest several years later). Lots of assumptions and beyond the scope of the study but it would be interesting to have a few sentences here that show that the tradeoff between protection and harvest doesn’t need to be so clear cut.</w:t>
+      </w:r>
+    </w:p>
+    <w:p>
+      <w:r>
+        <w:br/>
+      </w:r>
+      <w:r>
+        <w:rPr>
+          <w:highlight w:val="yellow"/>
+        </w:rPr>
+        <w:t xml:space="preserve">Line 301-303. </w:t>
+      </w:r>
+      <w:proofErr w:type="gramStart"/>
+      <w:r>
+        <w:rPr>
+          <w:highlight w:val="yellow"/>
+        </w:rPr>
+        <w:t>Yes</w:t>
+      </w:r>
+      <w:proofErr w:type="gramEnd"/>
+      <w:r>
+        <w:rPr>
+          <w:highlight w:val="yellow"/>
+        </w:rPr>
+        <w:t xml:space="preserve"> I was wondering about this the entire time reading the manuscript. Given the run timing changes each year why is a fixed calendar cut-off used? I am assuming because it can </w:t>
+      </w:r>
+      <w:proofErr w:type="gramStart"/>
+      <w:r>
+        <w:rPr>
+          <w:highlight w:val="yellow"/>
+        </w:rPr>
+        <w:t>actually be</w:t>
+      </w:r>
+      <w:proofErr w:type="gramEnd"/>
+      <w:r>
+        <w:rPr>
+          <w:highlight w:val="yellow"/>
+        </w:rPr>
+        <w:t xml:space="preserve"> implemented and provides some type of certainty for the harvest fisheries. Any other reasons why a </w:t>
+      </w:r>
+      <w:proofErr w:type="gramStart"/>
+      <w:r>
+        <w:rPr>
+          <w:highlight w:val="yellow"/>
+        </w:rPr>
+        <w:t>fixed-cutoff</w:t>
+      </w:r>
+      <w:proofErr w:type="gramEnd"/>
+      <w:r>
+        <w:rPr>
+          <w:highlight w:val="yellow"/>
+        </w:rPr>
+        <w:t xml:space="preserve"> would be beneficial? Or in other words given how difficult a dynamic cut-off window might be what type of increased protection would warrant going down that road?</w:t>
+      </w:r>
+      <w:r>
+        <w:br/>
+      </w:r>
+    </w:p>
+    <w:p/>
+    <w:p>
+      <w:r>
+        <w:br/>
+      </w:r>
+    </w:p>
+    <w:p/>
+    <w:p>
+      <w:r>
+        <w:rPr>
+          <w:highlight w:val="yellow"/>
+        </w:rPr>
         <w:lastRenderedPageBreak/>
-        <w:t>Discussion</w:t>
-      </w:r>
-      <w:r>
-        <w:br/>
-        <w:t>The discussion does a very good job of summarizing the results and explaining the potential implications for management. Since this is a study about return timing and spatial patterns within a large watershed the discussion could have been broader and incorporated findings from other Chinook salmon watersheds (e.g. Central Valley where lots of otolith work about tributary specific use of runs has been carried out).</w:t>
-      </w:r>
-      <w:r>
-        <w:br/>
-        <w:t xml:space="preserve">The tradeoff between protection and harvest is well illustrated but could be expanded further by exploring the effects of protecting species across multiple years. </w:t>
-      </w:r>
-      <w:proofErr w:type="gramStart"/>
-      <w:r>
-        <w:t>So</w:t>
-      </w:r>
-      <w:proofErr w:type="gramEnd"/>
-      <w:r>
-        <w:t xml:space="preserve"> by increasing protection in yr1 how much more harvest could be expected in the next return year (3 years later?). Over what time frame do </w:t>
-      </w:r>
-      <w:proofErr w:type="gramStart"/>
-      <w:r>
-        <w:t>these local harvest</w:t>
-      </w:r>
-      <w:proofErr w:type="gramEnd"/>
-      <w:r>
-        <w:t xml:space="preserve"> fisheries operate (could they </w:t>
-      </w:r>
-      <w:proofErr w:type="gramStart"/>
-      <w:r>
-        <w:t>compensate</w:t>
-      </w:r>
-      <w:proofErr w:type="gramEnd"/>
-      <w:r>
-        <w:t xml:space="preserve"> reduced harvest in a year with potentially higher harvest several years later). Lots of assumptions and beyond the scope of the study but it would be interesting to have a few sentences here that show that the tradeoff between protection and harvest doesn’t need to be so clear cut.</w:t>
-      </w:r>
-      <w:r>
-        <w:br/>
-        <w:t xml:space="preserve">Line 301-303. </w:t>
-      </w:r>
-      <w:proofErr w:type="gramStart"/>
-      <w:r>
-        <w:t>Yes</w:t>
-      </w:r>
-      <w:proofErr w:type="gramEnd"/>
-      <w:r>
-        <w:t xml:space="preserve"> I was wondering about this the entire time reading the manuscript. Given the run timing changes each year why is a fixed calendar cut-off used? I am assuming because it can </w:t>
-      </w:r>
-      <w:proofErr w:type="gramStart"/>
-      <w:r>
-        <w:t>actually be</w:t>
-      </w:r>
-      <w:proofErr w:type="gramEnd"/>
-      <w:r>
-        <w:t xml:space="preserve"> implemented and provides some type of certainty for the harvest fisheries. Any other reasons why a </w:t>
-      </w:r>
-      <w:proofErr w:type="gramStart"/>
-      <w:r>
-        <w:t>fixed-cutoff</w:t>
-      </w:r>
-      <w:proofErr w:type="gramEnd"/>
-      <w:r>
-        <w:t xml:space="preserve"> would be beneficial? Or in other words given how difficult a dynamic cut-off window might be what type of increased protection would warrant going down that road?</w:t>
-      </w:r>
-      <w:r>
-        <w:br/>
-      </w:r>
-      <w:r>
-        <w:br/>
         <w:t>Figures and Tables</w:t>
       </w:r>
       <w:r>
+        <w:rPr>
+          <w:highlight w:val="yellow"/>
+        </w:rPr>
         <w:br/>
         <w:t xml:space="preserve">Figure 3. Add more descriptive headings and text directly to the figure (so A-D are Quantiles and you can even give the date </w:t>
       </w:r>
       <w:proofErr w:type="gramStart"/>
       <w:r>
+        <w:rPr>
+          <w:highlight w:val="yellow"/>
+        </w:rPr>
         <w:t>ranges</w:t>
       </w:r>
       <w:proofErr w:type="gramEnd"/>
       <w:r>
+        <w:rPr>
+          <w:highlight w:val="yellow"/>
+        </w:rPr>
         <w:t xml:space="preserve">). Group1-Group6 </w:t>
       </w:r>
       <w:proofErr w:type="gramStart"/>
       <w:r>
+        <w:rPr>
+          <w:highlight w:val="yellow"/>
+        </w:rPr>
         <w:t>goes</w:t>
       </w:r>
       <w:proofErr w:type="gramEnd"/>
       <w:r>
+        <w:rPr>
+          <w:highlight w:val="yellow"/>
+        </w:rPr>
         <w:t xml:space="preserve"> upstream to downstream. Add sample n and add maybe light grey datapoints.</w:t>
       </w:r>
       <w:r>
@@ -1134,9 +1327,17 @@
       </w:r>
       <w:r>
         <w:br/>
+      </w:r>
+      <w:r>
+        <w:rPr>
+          <w:highlight w:val="yellow"/>
+        </w:rPr>
         <w:t>Data</w:t>
       </w:r>
       <w:r>
+        <w:rPr>
+          <w:highlight w:val="yellow"/>
+        </w:rPr>
         <w:br/>
         <w:t>Really good to see the data will be available! I think Dryad offers also “Data for review” which would have been helpful to look into details in Figure 3 and 4 during the review process and something to consider for future publications.</w:t>
       </w:r>
@@ -1159,31 +1360,30 @@
       </w:r>
       <w:r>
         <w:br/>
-        <w:t xml:space="preserve">This manuscript utilizes analysis of otolith isotope chemistry to reconstruct the migration timing of Chinook salmon bound for different portions of the Kuskokwim River watershed in southwest Alaska. Specifically, this manuscript evaluates the efficacy of a front end (early </w:t>
+        <w:t>This manuscript utilizes analysis of otolith isotope chemistry to reconstruct the migration timing of Chinook salmon bound for different portions of the Kuskokwim River watershed in southwest Alaska. Specifically, this manuscript evaluates the efficacy of a front end (early season) subsistence fishery closure in reducing harvest pressure on Chinook salmon stocks bound for upper portions of the watershed, and the potential implications of changes in the duration of this closure. Utilizing otoliths collected from the Bethel Test Fishery and the relative abundance (catch-per-unit-effort) across days within seasons, the authors describe the both the average pattern in the migration timing of stock components from different portions of the watershed, and importantly consider the among-year variability observed between 2017 and 2022.</w:t>
+      </w:r>
+      <w:r>
+        <w:br/>
+      </w:r>
+      <w:r>
+        <w:br/>
+        <w:t>In considering the potential conservation benefits of variation in the duration of the front end fishery closure from the perspective of conservation for Chinook salmon bound for upper portions of the watershed, the manuscript does an excellent job of quantifying the potential tradeoff between conservation benefit and foregone harvest opportunity for Chinook salmon overall.</w:t>
+      </w:r>
+      <w:r>
+        <w:br/>
+      </w:r>
+      <w:r>
+        <w:br/>
+        <w:t>The manuscript itself is very clearly written and approachable to a broad audience with limited expertise in otolith isotope chemistry, providing sufficient detail to understand both the data collection and analysis methods. A major benefit of the study as presented is the opportunity to not only quantify the average conservation benefit, and foregone harvest opportunity, but also the interannual variability in these metrics across the years of the study.</w:t>
+      </w:r>
+      <w:r>
+        <w:br/>
+      </w:r>
+      <w:r>
+        <w:br/>
       </w:r>
       <w:r>
         <w:lastRenderedPageBreak/>
-        <w:t>season) subsistence fishery closure in reducing harvest pressure on Chinook salmon stocks bound for upper portions of the watershed, and the potential implications of changes in the duration of this closure. Utilizing otoliths collected from the Bethel Test Fishery and the relative abundance (catch-per-unit-effort) across days within seasons, the authors describe the both the average pattern in the migration timing of stock components from different portions of the watershed, and importantly consider the among-year variability observed between 2017 and 2022.</w:t>
-      </w:r>
-      <w:r>
-        <w:br/>
-      </w:r>
-      <w:r>
-        <w:br/>
-        <w:t>In considering the potential conservation benefits of variation in the duration of the front end fishery closure from the perspective of conservation for Chinook salmon bound for upper portions of the watershed, the manuscript does an excellent job of quantifying the potential tradeoff between conservation benefit and foregone harvest opportunity for Chinook salmon overall.</w:t>
-      </w:r>
-      <w:r>
-        <w:br/>
-      </w:r>
-      <w:r>
-        <w:br/>
-        <w:t>The manuscript itself is very clearly written and approachable to a broad audience with limited expertise in otolith isotope chemistry, providing sufficient detail to understand both the data collection and analysis methods. A major benefit of the study as presented is the opportunity to not only quantify the average conservation benefit, and foregone harvest opportunity, but also the interannual variability in these metrics across the years of the study.</w:t>
-      </w:r>
-      <w:r>
-        <w:br/>
-      </w:r>
-      <w:r>
-        <w:br/>
         <w:t>Given the dual focus on both Chinook salmon migratory phenology within this watershed and the consideration and direct quantification of the management implications of migration timing differences among stock components, I believe this manuscript will be of interest to a wide readership.</w:t>
       </w:r>
       <w:r>
@@ -1211,62 +1411,64 @@
         <w:br/>
       </w:r>
       <w:r>
+        <w:br/>
+      </w:r>
+      <w:r>
+        <w:br/>
+        <w:t>In Figure 4, the y-axis label of “Cumulative Percent of Group’s Total Production” is a bit ambiguous. I would recommend changing the y-axis to “Cumulative Percent of Total Annual CPUE by Group” or “Cumulative Percent of Total Relative Abundance by Group”. Production is often cast in the context of a brood year rather than a return year, where as in this case the figure is describing the cumulative proportion of season total CPUE as apportioned among groups.</w:t>
+      </w:r>
+      <w:r>
+        <w:br/>
+      </w:r>
+      <w:r>
+        <w:br/>
+        <w:t>In Figure 5, I would encourage the authors to consider whether a more appropriate y-axis label might be “Percent of Relative Abundance Conserved”, “Percent of Relative Abundance Protected” something similar, as “Protection Effectiveness (%)” may be misinterpreted and a more specific label would avoid any potential confusion.</w:t>
+      </w:r>
+      <w:r>
+        <w:br/>
+      </w:r>
+      <w:r>
+        <w:br/>
+        <w:t>Specific Comments</w:t>
+      </w:r>
+      <w:r>
+        <w:br/>
+      </w:r>
+      <w:r>
+        <w:br/>
+        <w:t>Line 144 For the inline equation notation (</w:t>
+      </w:r>
+      <w:proofErr w:type="spellStart"/>
+      <w:r>
+        <w:t>r_j</w:t>
+      </w:r>
+      <w:proofErr w:type="spellEnd"/>
+      <w:r>
+        <w:t>) should be (</w:t>
+      </w:r>
+      <w:proofErr w:type="spellStart"/>
+      <w:r>
+        <w:t>rj</w:t>
+      </w:r>
+      <w:proofErr w:type="spellEnd"/>
+      <w:r>
+        <w:t>).</w:t>
+      </w:r>
+      <w:r>
+        <w:br/>
+      </w:r>
+      <w:r>
+        <w:br/>
+        <w:t>Lines 242-244 It may be clearer to describe “total relative abundance” rather than “total contribution” in this context for clarity.</w:t>
+      </w:r>
+      <w:r>
+        <w:br/>
+      </w:r>
+      <w:r>
+        <w:br/>
+      </w:r>
+      <w:r>
         <w:lastRenderedPageBreak/>
-        <w:br/>
-      </w:r>
-      <w:r>
-        <w:br/>
-        <w:t>In Figure 4, the y-axis label of “Cumulative Percent of Group’s Total Production” is a bit ambiguous. I would recommend changing the y-axis to “Cumulative Percent of Total Annual CPUE by Group” or “Cumulative Percent of Total Relative Abundance by Group”. Production is often cast in the context of a brood year rather than a return year, where as in this case the figure is describing the cumulative proportion of season total CPUE as apportioned among groups.</w:t>
-      </w:r>
-      <w:r>
-        <w:br/>
-      </w:r>
-      <w:r>
-        <w:br/>
-        <w:t>In Figure 5, I would encourage the authors to consider whether a more appropriate y-axis label might be “Percent of Relative Abundance Conserved”, “Percent of Relative Abundance Protected” something similar, as “Protection Effectiveness (%)” may be misinterpreted and a more specific label would avoid any potential confusion.</w:t>
-      </w:r>
-      <w:r>
-        <w:br/>
-      </w:r>
-      <w:r>
-        <w:br/>
-        <w:t>Specific Comments</w:t>
-      </w:r>
-      <w:r>
-        <w:br/>
-      </w:r>
-      <w:r>
-        <w:br/>
-        <w:t>Line 144 For the inline equation notation (</w:t>
-      </w:r>
-      <w:proofErr w:type="spellStart"/>
-      <w:r>
-        <w:t>r_j</w:t>
-      </w:r>
-      <w:proofErr w:type="spellEnd"/>
-      <w:r>
-        <w:t>) should be (</w:t>
-      </w:r>
-      <w:proofErr w:type="spellStart"/>
-      <w:r>
-        <w:t>rj</w:t>
-      </w:r>
-      <w:proofErr w:type="spellEnd"/>
-      <w:r>
-        <w:t>).</w:t>
-      </w:r>
-      <w:r>
-        <w:br/>
-      </w:r>
-      <w:r>
-        <w:br/>
-        <w:t>Lines 242-244 It may be clearer to describe “total relative abundance” rather than “total contribution” in this context for clarity.</w:t>
-      </w:r>
-      <w:r>
-        <w:br/>
-      </w:r>
-      <w:r>
-        <w:br/>
         <w:t>Line 249 For clarity, I recommend rephrasing “… a much larger range of protection across our dataset…” with “… a much larger range of relative abundance protected… “</w:t>
       </w:r>
       <w:r>
@@ -1288,46 +1490,46 @@
       </w:r>
       <w:r>
         <w:br/>
-        <w:t xml:space="preserve">Line 266 Suggest starting a new paragraph with the sentence “While a longer front-end closure…”, as this marks an important transition in the description of the results from a </w:t>
+        <w:t>Line 266 Suggest starting a new paragraph with the sentence “While a longer front-end closure…”, as this marks an important transition in the description of the results from a comparison of the conservation benefits of alternative closure durations, to a consideration of the potential costs to subsistence harvesters.</w:t>
+      </w:r>
+      <w:r>
+        <w:br/>
+      </w:r>
+      <w:r>
+        <w:br/>
+        <w:t>Line 271 Suggest rephrasing “… substantially increases protection for several groups; …” to “… increases protection for upriver groups; …” as a way to keep the reader oriented as to the interpretation of Group 1 &amp; 2 as the primary conservation beneficiaries being the upriver spawning stocks.</w:t>
+      </w:r>
+      <w:r>
+        <w:br/>
+      </w:r>
+      <w:r>
+        <w:br/>
+        <w:t>Line 279 Suggest reiterating the year range for the analyses with a parenthetical statement as “This relationship was consistent throughout our multi-year dataset (2017-2022) …” for clarity.</w:t>
+      </w:r>
+      <w:r>
+        <w:br/>
+      </w:r>
+      <w:r>
+        <w:br/>
+        <w:t>Line 326 When discussing the potential cost to harvest opportunity of the front end closure it would be useful to add the range across years in the total potential harvest falling within the front end closure window in addition to the average (12%).</w:t>
+      </w:r>
+      <w:r>
+        <w:br/>
+      </w:r>
+      <w:r>
+        <w:br/>
+        <w:t>Line 329 Similar to the recommendation above, it would be useful to indicate the min-max range of the additional potential harvest falling within the closure window, across years.</w:t>
+      </w:r>
+      <w:r>
+        <w:br/>
+      </w:r>
+      <w:r>
+        <w:br/>
+        <w:t xml:space="preserve">Including the ranges as suggested in the two comments above would highlight the heterogeneity in conservation costs to harvest opportunity among years, an understanding </w:t>
       </w:r>
       <w:r>
         <w:lastRenderedPageBreak/>
-        <w:t>comparison of the conservation benefits of alternative closure durations, to a consideration of the potential costs to subsistence harvesters.</w:t>
-      </w:r>
-      <w:r>
-        <w:br/>
-      </w:r>
-      <w:r>
-        <w:br/>
-        <w:t>Line 271 Suggest rephrasing “… substantially increases protection for several groups; …” to “… increases protection for upriver groups; …” as a way to keep the reader oriented as to the interpretation of Group 1 &amp; 2 as the primary conservation beneficiaries being the upriver spawning stocks.</w:t>
-      </w:r>
-      <w:r>
-        <w:br/>
-      </w:r>
-      <w:r>
-        <w:br/>
-        <w:t>Line 279 Suggest reiterating the year range for the analyses with a parenthetical statement as “This relationship was consistent throughout our multi-year dataset (2017-2022) …” for clarity.</w:t>
-      </w:r>
-      <w:r>
-        <w:br/>
-      </w:r>
-      <w:r>
-        <w:br/>
-        <w:t>Line 326 When discussing the potential cost to harvest opportunity of the front end closure it would be useful to add the range across years in the total potential harvest falling within the front end closure window in addition to the average (12%).</w:t>
-      </w:r>
-      <w:r>
-        <w:br/>
-      </w:r>
-      <w:r>
-        <w:br/>
-        <w:t>Line 329 Similar to the recommendation above, it would be useful to indicate the min-max range of the additional potential harvest falling within the closure window, across years.</w:t>
-      </w:r>
-      <w:r>
-        <w:br/>
-      </w:r>
-      <w:r>
-        <w:br/>
-        <w:t>Including the ranges as suggested in the two comments above would highlight the heterogeneity in conservation costs to harvest opportunity among years, an understanding of which is one of the major benefits of this multiyear study.</w:t>
+        <w:t>of which is one of the major benefits of this multiyear study.</w:t>
       </w:r>
       <w:r>
         <w:br/>

</xml_diff>